<commit_message>
Corrijo las figuras del documento de diseno y el servidor WSGI
</commit_message>
<xml_diff>
--- a/docs/gestion/INVENTRA_Propuesta_Tecnica_Economica.docx
+++ b/docs/gestion/INVENTRA_Propuesta_Tecnica_Economica.docx
@@ -145,7 +145,7 @@
           <w:left w:w="10" w:type="dxa"/>
           <w:right w:w="10" w:type="dxa"/>
         </w:tblCellMar>
-        <w:tblLook w:val="04A0" w:firstRow="1" w:lastRow="0" w:firstColumn="1" w:lastColumn="0" w:noHBand="0" w:noVBand="1"/>
+        <w:tblLook w:val="0000" w:firstRow="0" w:lastRow="0" w:firstColumn="0" w:lastColumn="0" w:noHBand="0" w:noVBand="0"/>
       </w:tblPr>
       <w:tblGrid>
         <w:gridCol w:w="1400"/>
@@ -154,6 +154,12 @@
         <w:gridCol w:w="3660"/>
       </w:tblGrid>
       <w:tr>
+        <w:tblPrEx>
+          <w:tblCellMar>
+            <w:top w:w="0" w:type="dxa"/>
+            <w:bottom w:w="0" w:type="dxa"/>
+          </w:tblCellMar>
+        </w:tblPrEx>
         <w:trPr>
           <w:tblHeader/>
         </w:trPr>
@@ -267,6 +273,12 @@
         </w:tc>
       </w:tr>
       <w:tr>
+        <w:tblPrEx>
+          <w:tblCellMar>
+            <w:top w:w="0" w:type="dxa"/>
+            <w:bottom w:w="0" w:type="dxa"/>
+          </w:tblCellMar>
+        </w:tblPrEx>
         <w:tc>
           <w:tcPr>
             <w:tcW w:w="1400" w:type="dxa"/>
@@ -1428,10 +1440,7 @@
         <w:jc w:val="both"/>
       </w:pPr>
       <w:r>
-        <w:t>Este documento presenta la propuesta técnica y económica para el desarrollo de INVENTRA, la aplicación web de inventario y ventas dirigida a licoreras y tiendas de barrio. Reúne la solución técnica, la metodología de trabajo, el plan de sprints con su cronograma, el equipo requerido y los costos asociados. Su contenido se apoya en los documentos de análisis y diseño ya elaborados para el proyecto y en el modelo de negocio aprobado, sin incorporar alcances distintos a los allí definidos</w:t>
-      </w:r>
-      <w:r>
-        <w:t>.</w:t>
+        <w:t>Este documento presenta la propuesta técnica y económica para el desarrollo de INVENTRA, la aplicación web de inventario y ventas dirigida a licoreras y tiendas de barrio. Reúne la solución técnica, la metodología de trabajo, el plan de sprints con su cronograma, el equipo requerido y los costos asociados. Su contenido se apoya en los documentos de análisis y diseño ya elaborados para el proyecto y en el modelo de negocio aprobado, sin incorporar alcances distintos a los allí definidos.</w:t>
       </w:r>
     </w:p>
     <w:p>
@@ -1458,10 +1467,7 @@
         <w:jc w:val="both"/>
       </w:pPr>
       <w:r>
-        <w:t>Desarrollar, probar y desplegar la aplicación web INVENTRA, con su versión móvil, de acuerdo con los cuarenta y ocho requisitos funcionales y los ocho requisitos no funcionales establecidos en la especificación de requisitos de software, y entregar la documentación técnica y de usuario que acompaña al producto</w:t>
-      </w:r>
-      <w:r>
-        <w:t>.</w:t>
+        <w:t>Desarrollar, probar y desplegar la aplicación web INVENTRA, con su versión móvil, de acuerdo con los cuarenta y ocho requisitos funcionales y los ocho requisitos no funcionales establecidos en la especificación de requisitos de software, y entregar la documentación técnica y de usuario que acompaña al producto.</w:t>
       </w:r>
     </w:p>
     <w:p>
@@ -1507,7 +1513,7 @@
           <w:left w:w="10" w:type="dxa"/>
           <w:right w:w="10" w:type="dxa"/>
         </w:tblCellMar>
-        <w:tblLook w:val="04A0" w:firstRow="1" w:lastRow="0" w:firstColumn="1" w:lastColumn="0" w:noHBand="0" w:noVBand="1"/>
+        <w:tblLook w:val="0000" w:firstRow="0" w:lastRow="0" w:firstColumn="0" w:lastColumn="0" w:noHBand="0" w:noVBand="0"/>
       </w:tblPr>
       <w:tblGrid>
         <w:gridCol w:w="2000"/>
@@ -1516,6 +1522,12 @@
         <w:gridCol w:w="1350"/>
       </w:tblGrid>
       <w:tr>
+        <w:tblPrEx>
+          <w:tblCellMar>
+            <w:top w:w="0" w:type="dxa"/>
+            <w:bottom w:w="0" w:type="dxa"/>
+          </w:tblCellMar>
+        </w:tblPrEx>
         <w:trPr>
           <w:tblHeader/>
         </w:trPr>
@@ -1629,6 +1641,12 @@
         </w:tc>
       </w:tr>
       <w:tr>
+        <w:tblPrEx>
+          <w:tblCellMar>
+            <w:top w:w="0" w:type="dxa"/>
+            <w:bottom w:w="0" w:type="dxa"/>
+          </w:tblCellMar>
+        </w:tblPrEx>
         <w:tc>
           <w:tcPr>
             <w:tcW w:w="2000" w:type="dxa"/>
@@ -1727,6 +1745,12 @@
         </w:tc>
       </w:tr>
       <w:tr>
+        <w:tblPrEx>
+          <w:tblCellMar>
+            <w:top w:w="0" w:type="dxa"/>
+            <w:bottom w:w="0" w:type="dxa"/>
+          </w:tblCellMar>
+        </w:tblPrEx>
         <w:tc>
           <w:tcPr>
             <w:tcW w:w="2000" w:type="dxa"/>
@@ -1825,6 +1849,12 @@
         </w:tc>
       </w:tr>
       <w:tr>
+        <w:tblPrEx>
+          <w:tblCellMar>
+            <w:top w:w="0" w:type="dxa"/>
+            <w:bottom w:w="0" w:type="dxa"/>
+          </w:tblCellMar>
+        </w:tblPrEx>
         <w:tc>
           <w:tcPr>
             <w:tcW w:w="2000" w:type="dxa"/>
@@ -1924,6 +1954,12 @@
         </w:tc>
       </w:tr>
       <w:tr>
+        <w:tblPrEx>
+          <w:tblCellMar>
+            <w:top w:w="0" w:type="dxa"/>
+            <w:bottom w:w="0" w:type="dxa"/>
+          </w:tblCellMar>
+        </w:tblPrEx>
         <w:tc>
           <w:tcPr>
             <w:tcW w:w="2000" w:type="dxa"/>
@@ -2022,6 +2058,12 @@
         </w:tc>
       </w:tr>
       <w:tr>
+        <w:tblPrEx>
+          <w:tblCellMar>
+            <w:top w:w="0" w:type="dxa"/>
+            <w:bottom w:w="0" w:type="dxa"/>
+          </w:tblCellMar>
+        </w:tblPrEx>
         <w:tc>
           <w:tcPr>
             <w:tcW w:w="2000" w:type="dxa"/>
@@ -2120,6 +2162,12 @@
         </w:tc>
       </w:tr>
       <w:tr>
+        <w:tblPrEx>
+          <w:tblCellMar>
+            <w:top w:w="0" w:type="dxa"/>
+            <w:bottom w:w="0" w:type="dxa"/>
+          </w:tblCellMar>
+        </w:tblPrEx>
         <w:tc>
           <w:tcPr>
             <w:tcW w:w="2000" w:type="dxa"/>
@@ -2218,6 +2266,12 @@
         </w:tc>
       </w:tr>
       <w:tr>
+        <w:tblPrEx>
+          <w:tblCellMar>
+            <w:top w:w="0" w:type="dxa"/>
+            <w:bottom w:w="0" w:type="dxa"/>
+          </w:tblCellMar>
+        </w:tblPrEx>
         <w:tc>
           <w:tcPr>
             <w:tcW w:w="2000" w:type="dxa"/>
@@ -2316,6 +2370,12 @@
         </w:tc>
       </w:tr>
       <w:tr>
+        <w:tblPrEx>
+          <w:tblCellMar>
+            <w:top w:w="0" w:type="dxa"/>
+            <w:bottom w:w="0" w:type="dxa"/>
+          </w:tblCellMar>
+        </w:tblPrEx>
         <w:tc>
           <w:tcPr>
             <w:tcW w:w="2000" w:type="dxa"/>
@@ -2414,6 +2474,12 @@
         </w:tc>
       </w:tr>
       <w:tr>
+        <w:tblPrEx>
+          <w:tblCellMar>
+            <w:top w:w="0" w:type="dxa"/>
+            <w:bottom w:w="0" w:type="dxa"/>
+          </w:tblCellMar>
+        </w:tblPrEx>
         <w:tc>
           <w:tcPr>
             <w:tcW w:w="2000" w:type="dxa"/>
@@ -2656,10 +2722,7 @@
         <w:jc w:val="both"/>
       </w:pPr>
       <w:r>
-        <w:t>La aplicación se construye bajo una arquitectura cliente–servidor con separación por capas. El cliente es una aplicación web de página única que consume una interfaz de programación de tipo REST; el servidor concentra la lógica de negocio, las reglas del dominio y el acceso a la base de datos. La organización interna separa la capa de presentación y servicios, la capa de aplicación con los casos de uso, la capa de dominio con las entidades y reglas —incluida la valoración por lotes— y la capa de infraestructura encargada de la persistencia y de los servicios externos</w:t>
-      </w:r>
-      <w:r>
-        <w:t>.</w:t>
+        <w:t>La aplicación se construye bajo una arquitectura cliente–servidor con separación por capas. El cliente es una aplicación web de página única que consume una interfaz de programación de tipo REST; el servidor concentra la lógica de negocio, las reglas del dominio y el acceso a la base de datos. La organización interna separa la capa de presentación y servicios, la capa de aplicación con los casos de uso, la capa de dominio con las entidades y reglas —incluida la valoración por lotes— y la capa de infraestructura encargada de la persistencia y de los servicios externos.</w:t>
       </w:r>
     </w:p>
     <w:p>
@@ -2705,7 +2768,7 @@
           <w:left w:w="10" w:type="dxa"/>
           <w:right w:w="10" w:type="dxa"/>
         </w:tblCellMar>
-        <w:tblLook w:val="04A0" w:firstRow="1" w:lastRow="0" w:firstColumn="1" w:lastColumn="0" w:noHBand="0" w:noVBand="1"/>
+        <w:tblLook w:val="0000" w:firstRow="0" w:lastRow="0" w:firstColumn="0" w:lastColumn="0" w:noHBand="0" w:noVBand="0"/>
       </w:tblPr>
       <w:tblGrid>
         <w:gridCol w:w="2300"/>
@@ -2713,6 +2776,12 @@
         <w:gridCol w:w="3660"/>
       </w:tblGrid>
       <w:tr>
+        <w:tblPrEx>
+          <w:tblCellMar>
+            <w:top w:w="0" w:type="dxa"/>
+            <w:bottom w:w="0" w:type="dxa"/>
+          </w:tblCellMar>
+        </w:tblPrEx>
         <w:trPr>
           <w:tblHeader/>
         </w:trPr>
@@ -2799,6 +2868,12 @@
         </w:tc>
       </w:tr>
       <w:tr>
+        <w:tblPrEx>
+          <w:tblCellMar>
+            <w:top w:w="0" w:type="dxa"/>
+            <w:bottom w:w="0" w:type="dxa"/>
+          </w:tblCellMar>
+        </w:tblPrEx>
         <w:tc>
           <w:tcPr>
             <w:tcW w:w="2300" w:type="dxa"/>
@@ -2877,6 +2952,12 @@
         </w:tc>
       </w:tr>
       <w:tr>
+        <w:tblPrEx>
+          <w:tblCellMar>
+            <w:top w:w="0" w:type="dxa"/>
+            <w:bottom w:w="0" w:type="dxa"/>
+          </w:tblCellMar>
+        </w:tblPrEx>
         <w:tc>
           <w:tcPr>
             <w:tcW w:w="2300" w:type="dxa"/>
@@ -2951,6 +3032,12 @@
         </w:tc>
       </w:tr>
       <w:tr>
+        <w:tblPrEx>
+          <w:tblCellMar>
+            <w:top w:w="0" w:type="dxa"/>
+            <w:bottom w:w="0" w:type="dxa"/>
+          </w:tblCellMar>
+        </w:tblPrEx>
         <w:tc>
           <w:tcPr>
             <w:tcW w:w="2300" w:type="dxa"/>
@@ -3025,6 +3112,12 @@
         </w:tc>
       </w:tr>
       <w:tr>
+        <w:tblPrEx>
+          <w:tblCellMar>
+            <w:top w:w="0" w:type="dxa"/>
+            <w:bottom w:w="0" w:type="dxa"/>
+          </w:tblCellMar>
+        </w:tblPrEx>
         <w:tc>
           <w:tcPr>
             <w:tcW w:w="2300" w:type="dxa"/>
@@ -3099,6 +3192,12 @@
         </w:tc>
       </w:tr>
       <w:tr>
+        <w:tblPrEx>
+          <w:tblCellMar>
+            <w:top w:w="0" w:type="dxa"/>
+            <w:bottom w:w="0" w:type="dxa"/>
+          </w:tblCellMar>
+        </w:tblPrEx>
         <w:tc>
           <w:tcPr>
             <w:tcW w:w="2300" w:type="dxa"/>
@@ -3143,7 +3242,7 @@
                 <w:sz w:val="19"/>
                 <w:szCs w:val="19"/>
               </w:rPr>
-              <w:t>Nginx y Gunicorn</w:t>
+              <w:t>Nginx y uWSGI</w:t>
             </w:r>
           </w:p>
         </w:tc>
@@ -3173,6 +3272,12 @@
         </w:tc>
       </w:tr>
       <w:tr>
+        <w:tblPrEx>
+          <w:tblCellMar>
+            <w:top w:w="0" w:type="dxa"/>
+            <w:bottom w:w="0" w:type="dxa"/>
+          </w:tblCellMar>
+        </w:tblPrEx>
         <w:tc>
           <w:tcPr>
             <w:tcW w:w="2300" w:type="dxa"/>
@@ -3415,13 +3520,19 @@
           <w:left w:w="10" w:type="dxa"/>
           <w:right w:w="10" w:type="dxa"/>
         </w:tblCellMar>
-        <w:tblLook w:val="04A0" w:firstRow="1" w:lastRow="0" w:firstColumn="1" w:lastColumn="0" w:noHBand="0" w:noVBand="1"/>
+        <w:tblLook w:val="0000" w:firstRow="0" w:lastRow="0" w:firstColumn="0" w:lastColumn="0" w:noHBand="0" w:noVBand="0"/>
       </w:tblPr>
       <w:tblGrid>
         <w:gridCol w:w="2400"/>
         <w:gridCol w:w="6960"/>
       </w:tblGrid>
       <w:tr>
+        <w:tblPrEx>
+          <w:tblCellMar>
+            <w:top w:w="0" w:type="dxa"/>
+            <w:bottom w:w="0" w:type="dxa"/>
+          </w:tblCellMar>
+        </w:tblPrEx>
         <w:trPr>
           <w:tblHeader/>
         </w:trPr>
@@ -3481,6 +3592,12 @@
         </w:tc>
       </w:tr>
       <w:tr>
+        <w:tblPrEx>
+          <w:tblCellMar>
+            <w:top w:w="0" w:type="dxa"/>
+            <w:bottom w:w="0" w:type="dxa"/>
+          </w:tblCellMar>
+        </w:tblPrEx>
         <w:tc>
           <w:tcPr>
             <w:tcW w:w="2400" w:type="dxa"/>
@@ -3531,6 +3648,12 @@
         </w:tc>
       </w:tr>
       <w:tr>
+        <w:tblPrEx>
+          <w:tblCellMar>
+            <w:top w:w="0" w:type="dxa"/>
+            <w:bottom w:w="0" w:type="dxa"/>
+          </w:tblCellMar>
+        </w:tblPrEx>
         <w:tc>
           <w:tcPr>
             <w:tcW w:w="2400" w:type="dxa"/>
@@ -3581,6 +3704,12 @@
         </w:tc>
       </w:tr>
       <w:tr>
+        <w:tblPrEx>
+          <w:tblCellMar>
+            <w:top w:w="0" w:type="dxa"/>
+            <w:bottom w:w="0" w:type="dxa"/>
+          </w:tblCellMar>
+        </w:tblPrEx>
         <w:tc>
           <w:tcPr>
             <w:tcW w:w="2400" w:type="dxa"/>
@@ -3694,7 +3823,7 @@
           <w:left w:w="10" w:type="dxa"/>
           <w:right w:w="10" w:type="dxa"/>
         </w:tblCellMar>
-        <w:tblLook w:val="04A0" w:firstRow="1" w:lastRow="0" w:firstColumn="1" w:lastColumn="0" w:noHBand="0" w:noVBand="1"/>
+        <w:tblLook w:val="0000" w:firstRow="0" w:lastRow="0" w:firstColumn="0" w:lastColumn="0" w:noHBand="0" w:noVBand="0"/>
       </w:tblPr>
       <w:tblGrid>
         <w:gridCol w:w="1750"/>
@@ -3703,6 +3832,12 @@
         <w:gridCol w:w="1300"/>
       </w:tblGrid>
       <w:tr>
+        <w:tblPrEx>
+          <w:tblCellMar>
+            <w:top w:w="0" w:type="dxa"/>
+            <w:bottom w:w="0" w:type="dxa"/>
+          </w:tblCellMar>
+        </w:tblPrEx>
         <w:trPr>
           <w:tblHeader/>
         </w:trPr>
@@ -3816,6 +3951,12 @@
         </w:tc>
       </w:tr>
       <w:tr>
+        <w:tblPrEx>
+          <w:tblCellMar>
+            <w:top w:w="0" w:type="dxa"/>
+            <w:bottom w:w="0" w:type="dxa"/>
+          </w:tblCellMar>
+        </w:tblPrEx>
         <w:tc>
           <w:tcPr>
             <w:tcW w:w="1750" w:type="dxa"/>
@@ -3914,6 +4055,12 @@
         </w:tc>
       </w:tr>
       <w:tr>
+        <w:tblPrEx>
+          <w:tblCellMar>
+            <w:top w:w="0" w:type="dxa"/>
+            <w:bottom w:w="0" w:type="dxa"/>
+          </w:tblCellMar>
+        </w:tblPrEx>
         <w:tc>
           <w:tcPr>
             <w:tcW w:w="1750" w:type="dxa"/>
@@ -4012,6 +4159,12 @@
         </w:tc>
       </w:tr>
       <w:tr>
+        <w:tblPrEx>
+          <w:tblCellMar>
+            <w:top w:w="0" w:type="dxa"/>
+            <w:bottom w:w="0" w:type="dxa"/>
+          </w:tblCellMar>
+        </w:tblPrEx>
         <w:tc>
           <w:tcPr>
             <w:tcW w:w="1750" w:type="dxa"/>
@@ -4110,6 +4263,12 @@
         </w:tc>
       </w:tr>
       <w:tr>
+        <w:tblPrEx>
+          <w:tblCellMar>
+            <w:top w:w="0" w:type="dxa"/>
+            <w:bottom w:w="0" w:type="dxa"/>
+          </w:tblCellMar>
+        </w:tblPrEx>
         <w:tc>
           <w:tcPr>
             <w:tcW w:w="1750" w:type="dxa"/>
@@ -4208,6 +4367,12 @@
         </w:tc>
       </w:tr>
       <w:tr>
+        <w:tblPrEx>
+          <w:tblCellMar>
+            <w:top w:w="0" w:type="dxa"/>
+            <w:bottom w:w="0" w:type="dxa"/>
+          </w:tblCellMar>
+        </w:tblPrEx>
         <w:tc>
           <w:tcPr>
             <w:tcW w:w="1750" w:type="dxa"/>
@@ -4306,6 +4471,12 @@
         </w:tc>
       </w:tr>
       <w:tr>
+        <w:tblPrEx>
+          <w:tblCellMar>
+            <w:top w:w="0" w:type="dxa"/>
+            <w:bottom w:w="0" w:type="dxa"/>
+          </w:tblCellMar>
+        </w:tblPrEx>
         <w:tc>
           <w:tcPr>
             <w:tcW w:w="1750" w:type="dxa"/>
@@ -4447,13 +4618,19 @@
           <w:left w:w="10" w:type="dxa"/>
           <w:right w:w="10" w:type="dxa"/>
         </w:tblCellMar>
-        <w:tblLook w:val="04A0" w:firstRow="1" w:lastRow="0" w:firstColumn="1" w:lastColumn="0" w:noHBand="0" w:noVBand="1"/>
+        <w:tblLook w:val="0000" w:firstRow="0" w:lastRow="0" w:firstColumn="0" w:lastColumn="0" w:noHBand="0" w:noVBand="0"/>
       </w:tblPr>
       <w:tblGrid>
         <w:gridCol w:w="6560"/>
         <w:gridCol w:w="2800"/>
       </w:tblGrid>
       <w:tr>
+        <w:tblPrEx>
+          <w:tblCellMar>
+            <w:top w:w="0" w:type="dxa"/>
+            <w:bottom w:w="0" w:type="dxa"/>
+          </w:tblCellMar>
+        </w:tblPrEx>
         <w:trPr>
           <w:tblHeader/>
         </w:trPr>
@@ -4513,6 +4690,12 @@
         </w:tc>
       </w:tr>
       <w:tr>
+        <w:tblPrEx>
+          <w:tblCellMar>
+            <w:top w:w="0" w:type="dxa"/>
+            <w:bottom w:w="0" w:type="dxa"/>
+          </w:tblCellMar>
+        </w:tblPrEx>
         <w:tc>
           <w:tcPr>
             <w:tcW w:w="6560" w:type="dxa"/>
@@ -4563,6 +4746,12 @@
         </w:tc>
       </w:tr>
       <w:tr>
+        <w:tblPrEx>
+          <w:tblCellMar>
+            <w:top w:w="0" w:type="dxa"/>
+            <w:bottom w:w="0" w:type="dxa"/>
+          </w:tblCellMar>
+        </w:tblPrEx>
         <w:tc>
           <w:tcPr>
             <w:tcW w:w="6560" w:type="dxa"/>
@@ -4613,6 +4802,12 @@
         </w:tc>
       </w:tr>
       <w:tr>
+        <w:tblPrEx>
+          <w:tblCellMar>
+            <w:top w:w="0" w:type="dxa"/>
+            <w:bottom w:w="0" w:type="dxa"/>
+          </w:tblCellMar>
+        </w:tblPrEx>
         <w:tc>
           <w:tcPr>
             <w:tcW w:w="6560" w:type="dxa"/>
@@ -4663,6 +4858,12 @@
         </w:tc>
       </w:tr>
       <w:tr>
+        <w:tblPrEx>
+          <w:tblCellMar>
+            <w:top w:w="0" w:type="dxa"/>
+            <w:bottom w:w="0" w:type="dxa"/>
+          </w:tblCellMar>
+        </w:tblPrEx>
         <w:tc>
           <w:tcPr>
             <w:tcW w:w="6560" w:type="dxa"/>
@@ -4713,6 +4914,12 @@
         </w:tc>
       </w:tr>
       <w:tr>
+        <w:tblPrEx>
+          <w:tblCellMar>
+            <w:top w:w="0" w:type="dxa"/>
+            <w:bottom w:w="0" w:type="dxa"/>
+          </w:tblCellMar>
+        </w:tblPrEx>
         <w:tc>
           <w:tcPr>
             <w:tcW w:w="6560" w:type="dxa"/>
@@ -4797,13 +5004,19 @@
           <w:left w:w="10" w:type="dxa"/>
           <w:right w:w="10" w:type="dxa"/>
         </w:tblCellMar>
-        <w:tblLook w:val="04A0" w:firstRow="1" w:lastRow="0" w:firstColumn="1" w:lastColumn="0" w:noHBand="0" w:noVBand="1"/>
+        <w:tblLook w:val="0000" w:firstRow="0" w:lastRow="0" w:firstColumn="0" w:lastColumn="0" w:noHBand="0" w:noVBand="0"/>
       </w:tblPr>
       <w:tblGrid>
         <w:gridCol w:w="2000"/>
         <w:gridCol w:w="7360"/>
       </w:tblGrid>
       <w:tr>
+        <w:tblPrEx>
+          <w:tblCellMar>
+            <w:top w:w="0" w:type="dxa"/>
+            <w:bottom w:w="0" w:type="dxa"/>
+          </w:tblCellMar>
+        </w:tblPrEx>
         <w:trPr>
           <w:tblHeader/>
         </w:trPr>
@@ -4863,6 +5076,12 @@
         </w:tc>
       </w:tr>
       <w:tr>
+        <w:tblPrEx>
+          <w:tblCellMar>
+            <w:top w:w="0" w:type="dxa"/>
+            <w:bottom w:w="0" w:type="dxa"/>
+          </w:tblCellMar>
+        </w:tblPrEx>
         <w:tc>
           <w:tcPr>
             <w:tcW w:w="2000" w:type="dxa"/>
@@ -4913,6 +5132,12 @@
         </w:tc>
       </w:tr>
       <w:tr>
+        <w:tblPrEx>
+          <w:tblCellMar>
+            <w:top w:w="0" w:type="dxa"/>
+            <w:bottom w:w="0" w:type="dxa"/>
+          </w:tblCellMar>
+        </w:tblPrEx>
         <w:tc>
           <w:tcPr>
             <w:tcW w:w="2000" w:type="dxa"/>
@@ -4963,6 +5188,12 @@
         </w:tc>
       </w:tr>
       <w:tr>
+        <w:tblPrEx>
+          <w:tblCellMar>
+            <w:top w:w="0" w:type="dxa"/>
+            <w:bottom w:w="0" w:type="dxa"/>
+          </w:tblCellMar>
+        </w:tblPrEx>
         <w:tc>
           <w:tcPr>
             <w:tcW w:w="2000" w:type="dxa"/>
@@ -5013,6 +5244,12 @@
         </w:tc>
       </w:tr>
       <w:tr>
+        <w:tblPrEx>
+          <w:tblCellMar>
+            <w:top w:w="0" w:type="dxa"/>
+            <w:bottom w:w="0" w:type="dxa"/>
+          </w:tblCellMar>
+        </w:tblPrEx>
         <w:tc>
           <w:tcPr>
             <w:tcW w:w="2000" w:type="dxa"/>
@@ -5109,7 +5346,7 @@
           <w:left w:w="10" w:type="dxa"/>
           <w:right w:w="10" w:type="dxa"/>
         </w:tblCellMar>
-        <w:tblLook w:val="04A0" w:firstRow="1" w:lastRow="0" w:firstColumn="1" w:lastColumn="0" w:noHBand="0" w:noVBand="1"/>
+        <w:tblLook w:val="0000" w:firstRow="0" w:lastRow="0" w:firstColumn="0" w:lastColumn="0" w:noHBand="0" w:noVBand="0"/>
       </w:tblPr>
       <w:tblGrid>
         <w:gridCol w:w="1800"/>
@@ -5117,6 +5354,12 @@
         <w:gridCol w:w="2660"/>
       </w:tblGrid>
       <w:tr>
+        <w:tblPrEx>
+          <w:tblCellMar>
+            <w:top w:w="0" w:type="dxa"/>
+            <w:bottom w:w="0" w:type="dxa"/>
+          </w:tblCellMar>
+        </w:tblPrEx>
         <w:trPr>
           <w:tblHeader/>
         </w:trPr>
@@ -5203,6 +5446,12 @@
         </w:tc>
       </w:tr>
       <w:tr>
+        <w:tblPrEx>
+          <w:tblCellMar>
+            <w:top w:w="0" w:type="dxa"/>
+            <w:bottom w:w="0" w:type="dxa"/>
+          </w:tblCellMar>
+        </w:tblPrEx>
         <w:tc>
           <w:tcPr>
             <w:tcW w:w="1800" w:type="dxa"/>
@@ -5277,6 +5526,12 @@
         </w:tc>
       </w:tr>
       <w:tr>
+        <w:tblPrEx>
+          <w:tblCellMar>
+            <w:top w:w="0" w:type="dxa"/>
+            <w:bottom w:w="0" w:type="dxa"/>
+          </w:tblCellMar>
+        </w:tblPrEx>
         <w:tc>
           <w:tcPr>
             <w:tcW w:w="1800" w:type="dxa"/>
@@ -5432,7 +5687,7 @@
           <w:left w:w="10" w:type="dxa"/>
           <w:right w:w="10" w:type="dxa"/>
         </w:tblCellMar>
-        <w:tblLook w:val="04A0" w:firstRow="1" w:lastRow="0" w:firstColumn="1" w:lastColumn="0" w:noHBand="0" w:noVBand="1"/>
+        <w:tblLook w:val="0000" w:firstRow="0" w:lastRow="0" w:firstColumn="0" w:lastColumn="0" w:noHBand="0" w:noVBand="0"/>
       </w:tblPr>
       <w:tblGrid>
         <w:gridCol w:w="3000"/>
@@ -5441,6 +5696,12 @@
         <w:gridCol w:w="2960"/>
       </w:tblGrid>
       <w:tr>
+        <w:tblPrEx>
+          <w:tblCellMar>
+            <w:top w:w="0" w:type="dxa"/>
+            <w:bottom w:w="0" w:type="dxa"/>
+          </w:tblCellMar>
+        </w:tblPrEx>
         <w:trPr>
           <w:tblHeader/>
         </w:trPr>
@@ -5554,6 +5815,12 @@
         </w:tc>
       </w:tr>
       <w:tr>
+        <w:tblPrEx>
+          <w:tblCellMar>
+            <w:top w:w="0" w:type="dxa"/>
+            <w:bottom w:w="0" w:type="dxa"/>
+          </w:tblCellMar>
+        </w:tblPrEx>
         <w:tc>
           <w:tcPr>
             <w:tcW w:w="3000" w:type="dxa"/>
@@ -5652,6 +5919,12 @@
         </w:tc>
       </w:tr>
       <w:tr>
+        <w:tblPrEx>
+          <w:tblCellMar>
+            <w:top w:w="0" w:type="dxa"/>
+            <w:bottom w:w="0" w:type="dxa"/>
+          </w:tblCellMar>
+        </w:tblPrEx>
         <w:tc>
           <w:tcPr>
             <w:tcW w:w="3000" w:type="dxa"/>
@@ -5750,6 +6023,12 @@
         </w:tc>
       </w:tr>
       <w:tr>
+        <w:tblPrEx>
+          <w:tblCellMar>
+            <w:top w:w="0" w:type="dxa"/>
+            <w:bottom w:w="0" w:type="dxa"/>
+          </w:tblCellMar>
+        </w:tblPrEx>
         <w:tc>
           <w:tcPr>
             <w:tcW w:w="3000" w:type="dxa"/>
@@ -5908,13 +6187,19 @@
           <w:left w:w="10" w:type="dxa"/>
           <w:right w:w="10" w:type="dxa"/>
         </w:tblCellMar>
-        <w:tblLook w:val="04A0" w:firstRow="1" w:lastRow="0" w:firstColumn="1" w:lastColumn="0" w:noHBand="0" w:noVBand="1"/>
+        <w:tblLook w:val="0000" w:firstRow="0" w:lastRow="0" w:firstColumn="0" w:lastColumn="0" w:noHBand="0" w:noVBand="0"/>
       </w:tblPr>
       <w:tblGrid>
         <w:gridCol w:w="2400"/>
         <w:gridCol w:w="6960"/>
       </w:tblGrid>
       <w:tr>
+        <w:tblPrEx>
+          <w:tblCellMar>
+            <w:top w:w="0" w:type="dxa"/>
+            <w:bottom w:w="0" w:type="dxa"/>
+          </w:tblCellMar>
+        </w:tblPrEx>
         <w:trPr>
           <w:tblHeader/>
         </w:trPr>
@@ -5974,6 +6259,12 @@
         </w:tc>
       </w:tr>
       <w:tr>
+        <w:tblPrEx>
+          <w:tblCellMar>
+            <w:top w:w="0" w:type="dxa"/>
+            <w:bottom w:w="0" w:type="dxa"/>
+          </w:tblCellMar>
+        </w:tblPrEx>
         <w:tc>
           <w:tcPr>
             <w:tcW w:w="2400" w:type="dxa"/>
@@ -6024,6 +6315,12 @@
         </w:tc>
       </w:tr>
       <w:tr>
+        <w:tblPrEx>
+          <w:tblCellMar>
+            <w:top w:w="0" w:type="dxa"/>
+            <w:bottom w:w="0" w:type="dxa"/>
+          </w:tblCellMar>
+        </w:tblPrEx>
         <w:tc>
           <w:tcPr>
             <w:tcW w:w="2400" w:type="dxa"/>
@@ -6074,6 +6371,12 @@
         </w:tc>
       </w:tr>
       <w:tr>
+        <w:tblPrEx>
+          <w:tblCellMar>
+            <w:top w:w="0" w:type="dxa"/>
+            <w:bottom w:w="0" w:type="dxa"/>
+          </w:tblCellMar>
+        </w:tblPrEx>
         <w:tc>
           <w:tcPr>
             <w:tcW w:w="2400" w:type="dxa"/>
@@ -6124,6 +6427,12 @@
         </w:tc>
       </w:tr>
       <w:tr>
+        <w:tblPrEx>
+          <w:tblCellMar>
+            <w:top w:w="0" w:type="dxa"/>
+            <w:bottom w:w="0" w:type="dxa"/>
+          </w:tblCellMar>
+        </w:tblPrEx>
         <w:tc>
           <w:tcPr>
             <w:tcW w:w="2400" w:type="dxa"/>
@@ -6174,6 +6483,12 @@
         </w:tc>
       </w:tr>
       <w:tr>
+        <w:tblPrEx>
+          <w:tblCellMar>
+            <w:top w:w="0" w:type="dxa"/>
+            <w:bottom w:w="0" w:type="dxa"/>
+          </w:tblCellMar>
+        </w:tblPrEx>
         <w:tc>
           <w:tcPr>
             <w:tcW w:w="2400" w:type="dxa"/>
@@ -6285,7 +6600,7 @@
           <w:left w:w="10" w:type="dxa"/>
           <w:right w:w="10" w:type="dxa"/>
         </w:tblCellMar>
-        <w:tblLook w:val="04A0" w:firstRow="1" w:lastRow="0" w:firstColumn="1" w:lastColumn="0" w:noHBand="0" w:noVBand="1"/>
+        <w:tblLook w:val="0000" w:firstRow="0" w:lastRow="0" w:firstColumn="0" w:lastColumn="0" w:noHBand="0" w:noVBand="0"/>
       </w:tblPr>
       <w:tblGrid>
         <w:gridCol w:w="4360"/>
@@ -6293,6 +6608,12 @@
         <w:gridCol w:w="2000"/>
       </w:tblGrid>
       <w:tr>
+        <w:tblPrEx>
+          <w:tblCellMar>
+            <w:top w:w="0" w:type="dxa"/>
+            <w:bottom w:w="0" w:type="dxa"/>
+          </w:tblCellMar>
+        </w:tblPrEx>
         <w:trPr>
           <w:tblHeader/>
         </w:trPr>
@@ -6379,6 +6700,12 @@
         </w:tc>
       </w:tr>
       <w:tr>
+        <w:tblPrEx>
+          <w:tblCellMar>
+            <w:top w:w="0" w:type="dxa"/>
+            <w:bottom w:w="0" w:type="dxa"/>
+          </w:tblCellMar>
+        </w:tblPrEx>
         <w:tc>
           <w:tcPr>
             <w:tcW w:w="4360" w:type="dxa"/>
@@ -6453,6 +6780,12 @@
         </w:tc>
       </w:tr>
       <w:tr>
+        <w:tblPrEx>
+          <w:tblCellMar>
+            <w:top w:w="0" w:type="dxa"/>
+            <w:bottom w:w="0" w:type="dxa"/>
+          </w:tblCellMar>
+        </w:tblPrEx>
         <w:tc>
           <w:tcPr>
             <w:tcW w:w="4360" w:type="dxa"/>
@@ -6527,6 +6860,12 @@
         </w:tc>
       </w:tr>
       <w:tr>
+        <w:tblPrEx>
+          <w:tblCellMar>
+            <w:top w:w="0" w:type="dxa"/>
+            <w:bottom w:w="0" w:type="dxa"/>
+          </w:tblCellMar>
+        </w:tblPrEx>
         <w:tc>
           <w:tcPr>
             <w:tcW w:w="4360" w:type="dxa"/>
@@ -6601,6 +6940,12 @@
         </w:tc>
       </w:tr>
       <w:tr>
+        <w:tblPrEx>
+          <w:tblCellMar>
+            <w:top w:w="0" w:type="dxa"/>
+            <w:bottom w:w="0" w:type="dxa"/>
+          </w:tblCellMar>
+        </w:tblPrEx>
         <w:tc>
           <w:tcPr>
             <w:tcW w:w="4360" w:type="dxa"/>
@@ -6675,6 +7020,12 @@
         </w:tc>
       </w:tr>
       <w:tr>
+        <w:tblPrEx>
+          <w:tblCellMar>
+            <w:top w:w="0" w:type="dxa"/>
+            <w:bottom w:w="0" w:type="dxa"/>
+          </w:tblCellMar>
+        </w:tblPrEx>
         <w:tc>
           <w:tcPr>
             <w:tcW w:w="4360" w:type="dxa"/>
@@ -6746,6 +7097,12 @@
         </w:tc>
       </w:tr>
       <w:tr>
+        <w:tblPrEx>
+          <w:tblCellMar>
+            <w:top w:w="0" w:type="dxa"/>
+            <w:bottom w:w="0" w:type="dxa"/>
+          </w:tblCellMar>
+        </w:tblPrEx>
         <w:tc>
           <w:tcPr>
             <w:tcW w:w="4360" w:type="dxa"/>
@@ -6820,6 +7177,12 @@
         </w:tc>
       </w:tr>
       <w:tr>
+        <w:tblPrEx>
+          <w:tblCellMar>
+            <w:top w:w="0" w:type="dxa"/>
+            <w:bottom w:w="0" w:type="dxa"/>
+          </w:tblCellMar>
+        </w:tblPrEx>
         <w:tc>
           <w:tcPr>
             <w:tcW w:w="4360" w:type="dxa"/>
@@ -7144,7 +7507,10 @@
         <w:spacing w:after="60" w:line="258" w:lineRule="auto"/>
       </w:pPr>
       <w:r>
-        <w:t>Documento técnico de diseño de INVENTRA, revisión 1.</w:t>
+        <w:t>Documento técnico de diseño de INVENTRA, revisión 1</w:t>
+      </w:r>
+      <w:r>
+        <w:t>.</w:t>
       </w:r>
     </w:p>
     <w:p>
@@ -7236,7 +7602,7 @@
         <w:sz w:val="18"/>
         <w:szCs w:val="18"/>
       </w:rPr>
-      <w:t>0</w:t>
+      <w:t>33</w:t>
     </w:r>
     <w:r>
       <w:rPr>
@@ -7271,10 +7637,10 @@
 <file path=word/numbering.xml><?xml version="1.0" encoding="utf-8"?>
 <w:numbering xmlns:wpc="http://schemas.microsoft.com/office/word/2010/wordprocessingCanvas" xmlns:cx="http://schemas.microsoft.com/office/drawing/2014/chartex" xmlns:cx1="http://schemas.microsoft.com/office/drawing/2015/9/8/chartex" xmlns:cx2="http://schemas.microsoft.com/office/drawing/2015/10/21/chartex" xmlns:cx3="http://schemas.microsoft.com/office/drawing/2016/5/9/chartex" xmlns:cx4="http://schemas.microsoft.com/office/drawing/2016/5/10/chartex" xmlns:cx5="http://schemas.microsoft.com/office/drawing/2016/5/11/chartex" xmlns:cx6="http://schemas.microsoft.com/office/drawing/2016/5/12/chartex" xmlns:cx7="http://schemas.microsoft.com/office/drawing/2016/5/13/chartex" xmlns:cx8="http://schemas.microsoft.com/office/drawing/2016/5/14/chartex" xmlns:mc="http://schemas.openxmlformats.org/markup-compatibility/2006" xmlns:aink="http://schemas.microsoft.com/office/drawing/2016/ink" xmlns:am3d="http://schemas.microsoft.com/office/drawing/2017/model3d" xmlns:o="urn:schemas-microsoft-com:office:office" xmlns:oel="http://schemas.microsoft.com/office/2019/extlst" xmlns:r="http://schemas.openxmlformats.org/officeDocument/2006/relationships" xmlns:m="http://schemas.openxmlformats.org/officeDocument/2006/math" xmlns:v="urn:schemas-microsoft-com:vml" xmlns:wp14="http://schemas.microsoft.com/office/word/2010/wordprocessingDrawing" xmlns:wp="http://schemas.openxmlformats.org/drawingml/2006/wordprocessingDrawing" xmlns:w10="urn:schemas-microsoft-com:office:word" xmlns:w="http://schemas.openxmlformats.org/wordprocessingml/2006/main" xmlns:w14="http://schemas.microsoft.com/office/word/2010/wordml" xmlns:w15="http://schemas.microsoft.com/office/word/2012/wordml" xmlns:w16cex="http://schemas.microsoft.com/office/word/2018/wordml/cex" xmlns:w16cid="http://schemas.microsoft.com/office/word/2016/wordml/cid" xmlns:w16="http://schemas.microsoft.com/office/word/2018/wordml" xmlns:w16du="http://schemas.microsoft.com/office/word/2023/wordml/word16du" xmlns:w16sdtdh="http://schemas.microsoft.com/office/word/2020/wordml/sdtdatahash" xmlns:w16sdtfl="http://schemas.microsoft.com/office/word/2024/wordml/sdtformatlock" xmlns:w16se="http://schemas.microsoft.com/office/word/2015/wordml/symex" xmlns:wpg="http://schemas.microsoft.com/office/word/2010/wordprocessingGroup" xmlns:wpi="http://schemas.microsoft.com/office/word/2010/wordprocessingInk" xmlns:wne="http://schemas.microsoft.com/office/word/2006/wordml" xmlns:wps="http://schemas.microsoft.com/office/word/2010/wordprocessingShape" mc:Ignorable="w14 w15 w16se w16cid w16 w16cex w16sdtdh w16sdtfl w16du wp14">
   <w:abstractNum w:abstractNumId="0" w15:restartNumberingAfterBreak="0">
-    <w:nsid w:val="79602BD7"/>
+    <w:nsid w:val="1FEA197C"/>
     <w:multiLevelType w:val="hybridMultilevel"/>
-    <w:tmpl w:val="1D360E60"/>
-    <w:lvl w:ilvl="0" w:tplc="D9F2A7AA">
+    <w:tmpl w:val="BF5E2C6A"/>
+    <w:lvl w:ilvl="0" w:tplc="3EA80F30">
       <w:start w:val="1"/>
       <w:numFmt w:val="bullet"/>
       <w:lvlText w:val="●"/>
@@ -7283,7 +7649,7 @@
         <w:ind w:left="720" w:hanging="360"/>
       </w:pPr>
     </w:lvl>
-    <w:lvl w:ilvl="1" w:tplc="95E26854">
+    <w:lvl w:ilvl="1" w:tplc="E04AF2D0">
       <w:start w:val="1"/>
       <w:numFmt w:val="bullet"/>
       <w:lvlText w:val="○"/>
@@ -7292,7 +7658,7 @@
         <w:ind w:left="1440" w:hanging="360"/>
       </w:pPr>
     </w:lvl>
-    <w:lvl w:ilvl="2" w:tplc="F9BA14C2">
+    <w:lvl w:ilvl="2" w:tplc="9EDAAAB0">
       <w:start w:val="1"/>
       <w:numFmt w:val="bullet"/>
       <w:lvlText w:val="■"/>
@@ -7301,7 +7667,7 @@
         <w:ind w:left="2160" w:hanging="360"/>
       </w:pPr>
     </w:lvl>
-    <w:lvl w:ilvl="3" w:tplc="9A02E586">
+    <w:lvl w:ilvl="3" w:tplc="A3268376">
       <w:start w:val="1"/>
       <w:numFmt w:val="bullet"/>
       <w:lvlText w:val="●"/>
@@ -7310,7 +7676,7 @@
         <w:ind w:left="2880" w:hanging="360"/>
       </w:pPr>
     </w:lvl>
-    <w:lvl w:ilvl="4" w:tplc="CF880D5C">
+    <w:lvl w:ilvl="4" w:tplc="B6069BCA">
       <w:start w:val="1"/>
       <w:numFmt w:val="bullet"/>
       <w:lvlText w:val="○"/>
@@ -7319,7 +7685,7 @@
         <w:ind w:left="3600" w:hanging="360"/>
       </w:pPr>
     </w:lvl>
-    <w:lvl w:ilvl="5" w:tplc="C70EF5C8">
+    <w:lvl w:ilvl="5" w:tplc="37A8AB90">
       <w:start w:val="1"/>
       <w:numFmt w:val="bullet"/>
       <w:lvlText w:val="■"/>
@@ -7328,7 +7694,7 @@
         <w:ind w:left="4320" w:hanging="360"/>
       </w:pPr>
     </w:lvl>
-    <w:lvl w:ilvl="6" w:tplc="824E7B7A">
+    <w:lvl w:ilvl="6" w:tplc="57B05AAA">
       <w:start w:val="1"/>
       <w:numFmt w:val="bullet"/>
       <w:lvlText w:val="●"/>
@@ -7337,7 +7703,7 @@
         <w:ind w:left="5040" w:hanging="360"/>
       </w:pPr>
     </w:lvl>
-    <w:lvl w:ilvl="7" w:tplc="92FC4162">
+    <w:lvl w:ilvl="7" w:tplc="92008734">
       <w:start w:val="1"/>
       <w:numFmt w:val="bullet"/>
       <w:lvlText w:val="●"/>
@@ -7346,7 +7712,7 @@
         <w:ind w:left="5760" w:hanging="360"/>
       </w:pPr>
     </w:lvl>
-    <w:lvl w:ilvl="8" w:tplc="A22628BC">
+    <w:lvl w:ilvl="8" w:tplc="36967E40">
       <w:start w:val="1"/>
       <w:numFmt w:val="bullet"/>
       <w:lvlText w:val="●"/>
@@ -7356,7 +7722,7 @@
       </w:pPr>
     </w:lvl>
   </w:abstractNum>
-  <w:num w:numId="1" w16cid:durableId="809244688">
+  <w:num w:numId="1" w16cid:durableId="1762221682">
     <w:abstractNumId w:val="0"/>
     <w:lvlOverride w:ilvl="0">
       <w:startOverride w:val="1"/>

</xml_diff>